<commit_message>
Terminado de instalar dependencias
</commit_message>
<xml_diff>
--- a/Documentacion/DSWB_2D_Mocosoft_1C26.docx
+++ b/Documentacion/DSWB_2D_Mocosoft_1C26.docx
@@ -1098,88 +1098,74 @@
           <w:sz w:val="24"/>
           <w:szCs w:val="24"/>
         </w:rPr>
-        <w:t>Tod</w:t>
-      </w:r>
+        <w:t>TodoStock</w:t>
+      </w:r>
+      <w:proofErr w:type="spellEnd"/>
       <w:r>
         <w:rPr>
           <w:sz w:val="24"/>
           <w:szCs w:val="24"/>
         </w:rPr>
-        <w:t>oStock</w:t>
-      </w:r>
-      <w:proofErr w:type="spellEnd"/>
-      <w:r>
+        <w:t>”</w:t>
+      </w:r>
+    </w:p>
+    <w:p>
+      <w:pPr>
         <w:rPr>
           <w:sz w:val="24"/>
           <w:szCs w:val="24"/>
         </w:rPr>
-        <w:t>”</w:t>
-      </w:r>
-    </w:p>
-    <w:p>
-      <w:pPr>
+      </w:pPr>
+      <w:r>
         <w:rPr>
           <w:sz w:val="24"/>
           <w:szCs w:val="24"/>
         </w:rPr>
-      </w:pPr>
+        <w:t>Introducción del proyecto: TO DO (usar el archivo .</w:t>
+      </w:r>
+      <w:proofErr w:type="spellStart"/>
       <w:r>
         <w:rPr>
           <w:sz w:val="24"/>
           <w:szCs w:val="24"/>
         </w:rPr>
-        <w:t>Introducción del proyecto: TO DO (usar el archivo .</w:t>
-      </w:r>
-      <w:proofErr w:type="spellStart"/>
+        <w:t>odt</w:t>
+      </w:r>
+      <w:proofErr w:type="spellEnd"/>
       <w:r>
         <w:rPr>
           <w:sz w:val="24"/>
           <w:szCs w:val="24"/>
         </w:rPr>
-        <w:t>odt</w:t>
-      </w:r>
-      <w:proofErr w:type="spellEnd"/>
-      <w:r>
+        <w:t xml:space="preserve"> de la carpeta compartida)</w:t>
+      </w:r>
+    </w:p>
+    <w:p/>
+    <w:p>
+      <w:pPr>
+        <w:pStyle w:val="Ttulo2"/>
+        <w:jc w:val="center"/>
+      </w:pPr>
+      <w:bookmarkStart w:id="5" w:name="_ro67c4gtfx1w" w:colFirst="0" w:colLast="0"/>
+      <w:bookmarkEnd w:id="5"/>
+      <w:r>
+        <w:t>Links relevantes</w:t>
+      </w:r>
+    </w:p>
+    <w:p>
+      <w:pPr>
+        <w:jc w:val="both"/>
         <w:rPr>
           <w:sz w:val="24"/>
           <w:szCs w:val="24"/>
         </w:rPr>
-        <w:t xml:space="preserve"> de la carpeta compartida)</w:t>
-      </w:r>
-    </w:p>
-    <w:p/>
-    <w:p>
-      <w:pPr>
-        <w:pStyle w:val="Ttulo2"/>
-        <w:jc w:val="center"/>
-      </w:pPr>
-      <w:bookmarkStart w:id="5" w:name="_ro67c4gtfx1w" w:colFirst="0" w:colLast="0"/>
-      <w:bookmarkEnd w:id="5"/>
-      <w:r>
-        <w:t>Links relevantes</w:t>
-      </w:r>
-    </w:p>
-    <w:p>
-      <w:pPr>
-        <w:jc w:val="both"/>
+      </w:pPr>
+      <w:r>
         <w:rPr>
           <w:sz w:val="24"/>
           <w:szCs w:val="24"/>
         </w:rPr>
-      </w:pPr>
-      <w:r>
-        <w:rPr>
-          <w:sz w:val="24"/>
-          <w:szCs w:val="24"/>
-        </w:rPr>
-        <w:t>Para esta primera entrega subimos el código del proyecto a GitHub, creamos un video explicando las tareas principales de cada integrante y compartimo</w:t>
-      </w:r>
-      <w:r>
-        <w:rPr>
-          <w:sz w:val="24"/>
-          <w:szCs w:val="24"/>
-        </w:rPr>
-        <w:t>s archivos necesarios en una carpeta de Google Drive.</w:t>
+        <w:t>Para esta primera entrega subimos el código del proyecto a GitHub, creamos un video explicando las tareas principales de cada integrante y compartimos archivos necesarios en una carpeta de Google Drive.</w:t>
       </w:r>
     </w:p>
     <w:p/>
@@ -2700,17 +2686,7 @@
           <w:szCs w:val="22"/>
         </w:rPr>
         <w:lastRenderedPageBreak/>
-        <w:t>Instalando Dependencias</w:t>
-      </w:r>
-      <w:r>
-        <w:rPr>
-          <w:b/>
-          <w:bCs/>
-          <w:color w:val="000000"/>
-          <w:sz w:val="22"/>
-          <w:szCs w:val="22"/>
-        </w:rPr>
-        <w:t xml:space="preserve"> y Git</w:t>
+        <w:t>Instalando Dependencias y Git</w:t>
       </w:r>
     </w:p>
     <w:p>
@@ -2807,28 +2783,7 @@
           <w:sz w:val="22"/>
           <w:szCs w:val="22"/>
         </w:rPr>
-        <w:t xml:space="preserve">Nota: Para </w:t>
-      </w:r>
-      <w:r>
-        <w:rPr>
-          <w:sz w:val="22"/>
-          <w:szCs w:val="22"/>
-        </w:rPr>
-        <w:t>ES Modules (ESM)</w:t>
-      </w:r>
-      <w:r>
-        <w:rPr>
-          <w:sz w:val="22"/>
-          <w:szCs w:val="22"/>
-        </w:rPr>
-        <w:t xml:space="preserve"> </w:t>
-      </w:r>
-      <w:r>
-        <w:rPr>
-          <w:sz w:val="22"/>
-          <w:szCs w:val="22"/>
-        </w:rPr>
-        <w:t>colocar la propiedad “</w:t>
+        <w:t>Nota: Para ES Modules (ESM) colocar la propiedad “</w:t>
       </w:r>
       <w:proofErr w:type="spellStart"/>
       <w:r>
@@ -2847,6 +2802,7 @@
         <w:t xml:space="preserve">”: “module” en el </w:t>
       </w:r>
       <w:proofErr w:type="spellStart"/>
+      <w:proofErr w:type="gramStart"/>
       <w:r>
         <w:rPr>
           <w:sz w:val="22"/>
@@ -2855,6 +2811,7 @@
         <w:t>package.json</w:t>
       </w:r>
       <w:proofErr w:type="spellEnd"/>
+      <w:proofErr w:type="gramEnd"/>
       <w:r>
         <w:rPr>
           <w:sz w:val="22"/>
@@ -3080,6 +3037,78 @@
           <w:szCs w:val="22"/>
         </w:rPr>
       </w:pPr>
+      <w:proofErr w:type="spellStart"/>
+      <w:r>
+        <w:rPr>
+          <w:color w:val="000000"/>
+          <w:sz w:val="22"/>
+          <w:szCs w:val="22"/>
+        </w:rPr>
+        <w:t>npm</w:t>
+      </w:r>
+      <w:proofErr w:type="spellEnd"/>
+      <w:r>
+        <w:rPr>
+          <w:color w:val="000000"/>
+          <w:sz w:val="22"/>
+          <w:szCs w:val="22"/>
+        </w:rPr>
+        <w:t xml:space="preserve"> </w:t>
+      </w:r>
+      <w:proofErr w:type="spellStart"/>
+      <w:r>
+        <w:rPr>
+          <w:color w:val="000000"/>
+          <w:sz w:val="22"/>
+          <w:szCs w:val="22"/>
+        </w:rPr>
+        <w:t>install</w:t>
+      </w:r>
+      <w:proofErr w:type="spellEnd"/>
+      <w:r>
+        <w:rPr>
+          <w:color w:val="000000"/>
+          <w:sz w:val="22"/>
+          <w:szCs w:val="22"/>
+        </w:rPr>
+        <w:t xml:space="preserve"> –</w:t>
+      </w:r>
+      <w:proofErr w:type="spellStart"/>
+      <w:r>
+        <w:rPr>
+          <w:color w:val="000000"/>
+          <w:sz w:val="22"/>
+          <w:szCs w:val="22"/>
+        </w:rPr>
+        <w:t>save</w:t>
+      </w:r>
+      <w:proofErr w:type="spellEnd"/>
+      <w:r>
+        <w:rPr>
+          <w:color w:val="000000"/>
+          <w:sz w:val="22"/>
+          <w:szCs w:val="22"/>
+        </w:rPr>
+        <w:t xml:space="preserve"> </w:t>
+      </w:r>
+      <w:proofErr w:type="spellStart"/>
+      <w:r>
+        <w:rPr>
+          <w:color w:val="000000"/>
+          <w:sz w:val="22"/>
+          <w:szCs w:val="22"/>
+        </w:rPr>
+        <w:t>pug</w:t>
+      </w:r>
+      <w:proofErr w:type="spellEnd"/>
+      <w:r>
+        <w:rPr>
+          <w:color w:val="000000"/>
+          <w:sz w:val="22"/>
+          <w:szCs w:val="22"/>
+        </w:rPr>
+        <w:br/>
+      </w:r>
     </w:p>
     <w:p>
       <w:pPr>
@@ -3163,6 +3192,7 @@
         <w:t xml:space="preserve"> </w:t>
       </w:r>
       <w:proofErr w:type="spellStart"/>
+      <w:proofErr w:type="gramStart"/>
       <w:r>
         <w:rPr>
           <w:color w:val="000000"/>
@@ -3180,6 +3210,7 @@
         </w:rPr>
         <w:t xml:space="preserve"> .</w:t>
       </w:r>
+      <w:proofErr w:type="gramEnd"/>
     </w:p>
     <w:p>
       <w:pPr>
@@ -3515,6 +3546,7 @@
         <w:t xml:space="preserve">├── </w:t>
       </w:r>
       <w:proofErr w:type="spellStart"/>
+      <w:proofErr w:type="gramStart"/>
       <w:r>
         <w:rPr>
           <w:color w:val="000000"/>
@@ -3524,6 +3556,7 @@
         <w:t>package.json</w:t>
       </w:r>
       <w:proofErr w:type="spellEnd"/>
+      <w:proofErr w:type="gramEnd"/>
     </w:p>
     <w:p>
       <w:pPr>
@@ -4409,7 +4442,9 @@
           <w:szCs w:val="24"/>
         </w:rPr>
         <w:br/>
-      </w:r>
+        <w:t xml:space="preserve">5. Módulo 2: Compras (conectado con </w:t>
+      </w:r>
+      <w:proofErr w:type="spellStart"/>
       <w:r>
         <w:rPr>
           <w:rFonts w:ascii="Inter" w:hAnsi="Inter"/>
@@ -4419,9 +4454,9 @@
           <w:sz w:val="24"/>
           <w:szCs w:val="24"/>
         </w:rPr>
-        <w:t xml:space="preserve">5. Módulo 2: Compras (conectado con </w:t>
-      </w:r>
-      <w:proofErr w:type="spellStart"/>
+        <w:t>MaestroProductos</w:t>
+      </w:r>
+      <w:proofErr w:type="spellEnd"/>
       <w:r>
         <w:rPr>
           <w:rFonts w:ascii="Inter" w:hAnsi="Inter"/>
@@ -4431,10 +4466,14 @@
           <w:sz w:val="24"/>
           <w:szCs w:val="24"/>
         </w:rPr>
-        <w:t>MaestroProductos</w:t>
-      </w:r>
-      <w:proofErr w:type="spellEnd"/>
-      <w:r>
+        <w:t>)</w:t>
+      </w:r>
+    </w:p>
+    <w:p>
+      <w:pPr>
+        <w:pStyle w:val="Ttulo3"/>
+        <w:shd w:val="clear" w:color="auto" w:fill="FFFFFF"/>
+        <w:spacing w:before="480" w:after="240" w:line="450" w:lineRule="atLeast"/>
         <w:rPr>
           <w:rFonts w:ascii="Inter" w:hAnsi="Inter"/>
           <w:b/>
@@ -4443,14 +4482,8 @@
           <w:sz w:val="24"/>
           <w:szCs w:val="24"/>
         </w:rPr>
-        <w:t>)</w:t>
-      </w:r>
-    </w:p>
-    <w:p>
-      <w:pPr>
-        <w:pStyle w:val="Ttulo3"/>
-        <w:shd w:val="clear" w:color="auto" w:fill="FFFFFF"/>
-        <w:spacing w:before="480" w:after="240" w:line="450" w:lineRule="atLeast"/>
+      </w:pPr>
+      <w:r>
         <w:rPr>
           <w:rFonts w:ascii="Inter" w:hAnsi="Inter"/>
           <w:b/>
@@ -4459,8 +4492,14 @@
           <w:sz w:val="24"/>
           <w:szCs w:val="24"/>
         </w:rPr>
-      </w:pPr>
-      <w:r>
+        <w:t>6. Agregar middleware de validación y manejo de errores</w:t>
+      </w:r>
+    </w:p>
+    <w:p>
+      <w:pPr>
+        <w:pStyle w:val="Ttulo3"/>
+        <w:shd w:val="clear" w:color="auto" w:fill="FFFFFF"/>
+        <w:spacing w:before="480" w:after="240" w:line="450" w:lineRule="atLeast"/>
         <w:rPr>
           <w:rFonts w:ascii="Inter" w:hAnsi="Inter"/>
           <w:b/>
@@ -4469,14 +4508,8 @@
           <w:sz w:val="24"/>
           <w:szCs w:val="24"/>
         </w:rPr>
-        <w:t>6. Agregar middleware de validación y manejo de errores</w:t>
-      </w:r>
-    </w:p>
-    <w:p>
-      <w:pPr>
-        <w:pStyle w:val="Ttulo3"/>
-        <w:shd w:val="clear" w:color="auto" w:fill="FFFFFF"/>
-        <w:spacing w:before="480" w:after="240" w:line="450" w:lineRule="atLeast"/>
+      </w:pPr>
+      <w:r>
         <w:rPr>
           <w:rFonts w:ascii="Inter" w:hAnsi="Inter"/>
           <w:b/>
@@ -4485,7 +4518,9 @@
           <w:sz w:val="24"/>
           <w:szCs w:val="24"/>
         </w:rPr>
-      </w:pPr>
+        <w:t xml:space="preserve">7. Probar con </w:t>
+      </w:r>
+      <w:proofErr w:type="spellStart"/>
       <w:r>
         <w:rPr>
           <w:rFonts w:ascii="Inter" w:hAnsi="Inter"/>
@@ -4495,9 +4530,9 @@
           <w:sz w:val="24"/>
           <w:szCs w:val="24"/>
         </w:rPr>
-        <w:t xml:space="preserve">7. Probar con </w:t>
-      </w:r>
-      <w:proofErr w:type="spellStart"/>
+        <w:t>Thunder</w:t>
+      </w:r>
+      <w:proofErr w:type="spellEnd"/>
       <w:r>
         <w:rPr>
           <w:rFonts w:ascii="Inter" w:hAnsi="Inter"/>
@@ -4507,9 +4542,9 @@
           <w:sz w:val="24"/>
           <w:szCs w:val="24"/>
         </w:rPr>
-        <w:t>Thunder</w:t>
-      </w:r>
-      <w:proofErr w:type="spellEnd"/>
+        <w:t xml:space="preserve"> Client o </w:t>
+      </w:r>
+      <w:proofErr w:type="spellStart"/>
       <w:r>
         <w:rPr>
           <w:rFonts w:ascii="Inter" w:hAnsi="Inter"/>
@@ -4519,9 +4554,47 @@
           <w:sz w:val="24"/>
           <w:szCs w:val="24"/>
         </w:rPr>
-        <w:t xml:space="preserve"> Client</w:t>
-      </w:r>
-      <w:r>
+        <w:t>Postman</w:t>
+      </w:r>
+      <w:proofErr w:type="spellEnd"/>
+    </w:p>
+    <w:p>
+      <w:pPr>
+        <w:pStyle w:val="Ttulo3"/>
+        <w:shd w:val="clear" w:color="auto" w:fill="FFFFFF"/>
+        <w:spacing w:before="480" w:after="240" w:line="450" w:lineRule="atLeast"/>
+        <w:rPr>
+          <w:rFonts w:ascii="Inter" w:hAnsi="Inter"/>
+          <w:color w:val="0F1115"/>
+          <w:sz w:val="30"/>
+          <w:szCs w:val="30"/>
+        </w:rPr>
+      </w:pPr>
+    </w:p>
+    <w:p>
+      <w:pPr>
+        <w:rPr>
+          <w:rFonts w:ascii="Inter" w:hAnsi="Inter"/>
+          <w:color w:val="0F1115"/>
+          <w:sz w:val="33"/>
+          <w:szCs w:val="33"/>
+        </w:rPr>
+      </w:pPr>
+      <w:r>
+        <w:rPr>
+          <w:rFonts w:ascii="Inter" w:hAnsi="Inter"/>
+          <w:color w:val="0F1115"/>
+          <w:sz w:val="33"/>
+          <w:szCs w:val="33"/>
+        </w:rPr>
+        <w:br w:type="page"/>
+      </w:r>
+    </w:p>
+    <w:p>
+      <w:pPr>
+        <w:pStyle w:val="Ttulo2"/>
+        <w:shd w:val="clear" w:color="auto" w:fill="FFFFFF"/>
+        <w:spacing w:before="480" w:after="240" w:line="480" w:lineRule="atLeast"/>
         <w:rPr>
           <w:rFonts w:ascii="Inter" w:hAnsi="Inter"/>
           <w:b/>
@@ -4530,9 +4603,7 @@
           <w:sz w:val="24"/>
           <w:szCs w:val="24"/>
         </w:rPr>
-        <w:t xml:space="preserve"> o </w:t>
-      </w:r>
-      <w:proofErr w:type="spellStart"/>
+      </w:pPr>
       <w:r>
         <w:rPr>
           <w:rFonts w:ascii="Inter" w:hAnsi="Inter"/>
@@ -4542,78 +4613,8 @@
           <w:sz w:val="24"/>
           <w:szCs w:val="24"/>
         </w:rPr>
-        <w:t>Postman</w:t>
-      </w:r>
-      <w:proofErr w:type="spellEnd"/>
-    </w:p>
-    <w:p>
-      <w:pPr>
-        <w:pStyle w:val="Ttulo3"/>
-        <w:shd w:val="clear" w:color="auto" w:fill="FFFFFF"/>
-        <w:spacing w:before="480" w:after="240" w:line="450" w:lineRule="atLeast"/>
-        <w:rPr>
-          <w:rFonts w:ascii="Inter" w:hAnsi="Inter"/>
-          <w:color w:val="0F1115"/>
-          <w:sz w:val="30"/>
-          <w:szCs w:val="30"/>
-        </w:rPr>
-      </w:pPr>
-    </w:p>
-    <w:p>
-      <w:pPr>
-        <w:rPr>
-          <w:rFonts w:ascii="Inter" w:hAnsi="Inter"/>
-          <w:color w:val="0F1115"/>
-          <w:sz w:val="33"/>
-          <w:szCs w:val="33"/>
-        </w:rPr>
-      </w:pPr>
-      <w:r>
-        <w:rPr>
-          <w:rFonts w:ascii="Inter" w:hAnsi="Inter"/>
-          <w:color w:val="0F1115"/>
-          <w:sz w:val="33"/>
-          <w:szCs w:val="33"/>
-        </w:rPr>
-        <w:br w:type="page"/>
-      </w:r>
-    </w:p>
-    <w:p>
-      <w:pPr>
-        <w:pStyle w:val="Ttulo2"/>
-        <w:shd w:val="clear" w:color="auto" w:fill="FFFFFF"/>
-        <w:spacing w:before="480" w:after="240" w:line="480" w:lineRule="atLeast"/>
-        <w:rPr>
-          <w:rFonts w:ascii="Inter" w:hAnsi="Inter"/>
-          <w:b/>
-          <w:bCs/>
-          <w:color w:val="0F1115"/>
-          <w:sz w:val="24"/>
-          <w:szCs w:val="24"/>
-        </w:rPr>
-      </w:pPr>
-      <w:r>
-        <w:rPr>
-          <w:rFonts w:ascii="Inter" w:hAnsi="Inter"/>
-          <w:b/>
-          <w:bCs/>
-          <w:color w:val="0F1115"/>
-          <w:sz w:val="24"/>
-          <w:szCs w:val="24"/>
-        </w:rPr>
         <w:lastRenderedPageBreak/>
-        <w:t>D</w:t>
-      </w:r>
-      <w:r>
-        <w:rPr>
-          <w:rFonts w:ascii="Inter" w:hAnsi="Inter"/>
-          <w:b/>
-          <w:bCs/>
-          <w:color w:val="0F1115"/>
-          <w:sz w:val="24"/>
-          <w:szCs w:val="24"/>
-        </w:rPr>
-        <w:t>istribución de tareas (4 integrantes)</w:t>
+        <w:t>Distribución de tareas (4 integrantes)</w:t>
       </w:r>
     </w:p>
     <w:tbl>
@@ -5559,13 +5560,18 @@
         </w:numPr>
       </w:pPr>
       <w:r>
-        <w:t>GET /api/productos/:</w:t>
+        <w:t>GET /api/productos</w:t>
+      </w:r>
+      <w:proofErr w:type="gramStart"/>
+      <w:r>
+        <w:t>/:</w:t>
       </w:r>
       <w:proofErr w:type="spellStart"/>
       <w:r>
         <w:t>idProducto</w:t>
       </w:r>
       <w:proofErr w:type="spellEnd"/>
+      <w:proofErr w:type="gramEnd"/>
     </w:p>
     <w:p>
       <w:pPr>
@@ -5586,13 +5592,18 @@
         </w:numPr>
       </w:pPr>
       <w:r>
-        <w:t>PUT /api/productos/:</w:t>
+        <w:t>PUT /api/productos</w:t>
+      </w:r>
+      <w:proofErr w:type="gramStart"/>
+      <w:r>
+        <w:t>/:</w:t>
       </w:r>
       <w:proofErr w:type="spellStart"/>
       <w:r>
         <w:t>idProducto</w:t>
       </w:r>
       <w:proofErr w:type="spellEnd"/>
+      <w:proofErr w:type="gramEnd"/>
     </w:p>
     <w:p>
       <w:pPr>
@@ -5602,13 +5613,18 @@
         </w:numPr>
       </w:pPr>
       <w:r>
-        <w:t>DELETE /api/productos/:</w:t>
+        <w:t>DELETE /api/productos</w:t>
+      </w:r>
+      <w:proofErr w:type="gramStart"/>
+      <w:r>
+        <w:t>/:</w:t>
       </w:r>
       <w:proofErr w:type="spellStart"/>
       <w:r>
         <w:t>idProducto</w:t>
       </w:r>
       <w:proofErr w:type="spellEnd"/>
+      <w:proofErr w:type="gramEnd"/>
     </w:p>
     <w:p>
       <w:r>
@@ -5623,12 +5639,17 @@
         </w:numPr>
       </w:pPr>
       <w:proofErr w:type="spellStart"/>
+      <w:proofErr w:type="gramStart"/>
       <w:r>
         <w:t>obtenerProductos</w:t>
       </w:r>
       <w:proofErr w:type="spellEnd"/>
       <w:r>
-        <w:t>()</w:t>
+        <w:t>(</w:t>
+      </w:r>
+      <w:proofErr w:type="gramEnd"/>
+      <w:r>
+        <w:t>)</w:t>
       </w:r>
     </w:p>
     <w:p>
@@ -5679,6 +5700,7 @@
         </w:numPr>
       </w:pPr>
       <w:proofErr w:type="spellStart"/>
+      <w:proofErr w:type="gramStart"/>
       <w:r>
         <w:t>editarProducto</w:t>
       </w:r>
@@ -5687,6 +5709,7 @@
         <w:t>(</w:t>
       </w:r>
       <w:proofErr w:type="spellStart"/>
+      <w:proofErr w:type="gramEnd"/>
       <w:r>
         <w:t>idProducto</w:t>
       </w:r>
@@ -5740,12 +5763,17 @@
         </w:numPr>
       </w:pPr>
       <w:proofErr w:type="spellStart"/>
+      <w:proofErr w:type="gramStart"/>
       <w:r>
         <w:t>obtenerProductos</w:t>
       </w:r>
       <w:proofErr w:type="spellEnd"/>
       <w:r>
-        <w:t>()</w:t>
+        <w:t>(</w:t>
+      </w:r>
+      <w:proofErr w:type="gramEnd"/>
+      <w:r>
+        <w:t>)</w:t>
       </w:r>
     </w:p>
     <w:p>
@@ -5757,10 +5785,7 @@
       </w:pPr>
       <w:proofErr w:type="spellStart"/>
       <w:r>
-        <w:t>obtene</w:t>
-      </w:r>
-      <w:r>
-        <w:t>rProductoPorId</w:t>
+        <w:t>obtenerProductoPorId</w:t>
       </w:r>
       <w:proofErr w:type="spellEnd"/>
       <w:r>
@@ -5799,6 +5824,7 @@
         </w:numPr>
       </w:pPr>
       <w:proofErr w:type="spellStart"/>
+      <w:proofErr w:type="gramStart"/>
       <w:r>
         <w:t>actualizarProducto</w:t>
       </w:r>
@@ -5807,6 +5833,7 @@
         <w:t>(</w:t>
       </w:r>
       <w:proofErr w:type="spellStart"/>
+      <w:proofErr w:type="gramEnd"/>
       <w:r>
         <w:t>idProducto</w:t>
       </w:r>
@@ -5913,10 +5940,7 @@
         </w:numPr>
       </w:pPr>
       <w:r>
-        <w:t>Formula</w:t>
-      </w:r>
-      <w:r>
-        <w:t>rio editar producto catálogo</w:t>
+        <w:t>Formulario editar producto catálogo</w:t>
       </w:r>
     </w:p>
     <w:p>
@@ -5955,6 +5979,7 @@
         <w:t>maestroproductos</w:t>
       </w:r>
       <w:proofErr w:type="spellEnd"/>
+      <w:proofErr w:type="gramStart"/>
       <w:r>
         <w:t>/:</w:t>
       </w:r>
@@ -5963,6 +5988,7 @@
         <w:t>idProducto</w:t>
       </w:r>
       <w:proofErr w:type="spellEnd"/>
+      <w:proofErr w:type="gramEnd"/>
     </w:p>
     <w:p>
       <w:pPr>
@@ -5995,6 +6021,7 @@
         <w:t>maestroproductos</w:t>
       </w:r>
       <w:proofErr w:type="spellEnd"/>
+      <w:proofErr w:type="gramStart"/>
       <w:r>
         <w:t>/:</w:t>
       </w:r>
@@ -6003,6 +6030,7 @@
         <w:t>idProducto</w:t>
       </w:r>
       <w:proofErr w:type="spellEnd"/>
+      <w:proofErr w:type="gramEnd"/>
     </w:p>
     <w:p>
       <w:pPr>
@@ -6019,6 +6047,7 @@
         <w:t>maestroproductos</w:t>
       </w:r>
       <w:proofErr w:type="spellEnd"/>
+      <w:proofErr w:type="gramStart"/>
       <w:r>
         <w:t>/:</w:t>
       </w:r>
@@ -6027,6 +6056,7 @@
         <w:t>idProducto</w:t>
       </w:r>
       <w:proofErr w:type="spellEnd"/>
+      <w:proofErr w:type="gramEnd"/>
     </w:p>
     <w:p>
       <w:r>
@@ -6041,12 +6071,17 @@
         </w:numPr>
       </w:pPr>
       <w:proofErr w:type="spellStart"/>
+      <w:proofErr w:type="gramStart"/>
       <w:r>
         <w:t>obtenerCatalogo</w:t>
       </w:r>
       <w:proofErr w:type="spellEnd"/>
       <w:r>
-        <w:t>()</w:t>
+        <w:t>(</w:t>
+      </w:r>
+      <w:proofErr w:type="gramEnd"/>
+      <w:r>
+        <w:t>)</w:t>
       </w:r>
     </w:p>
     <w:p>
@@ -6097,6 +6132,7 @@
         </w:numPr>
       </w:pPr>
       <w:proofErr w:type="spellStart"/>
+      <w:proofErr w:type="gramStart"/>
       <w:r>
         <w:t>editarProductoCatalogo</w:t>
       </w:r>
@@ -6105,6 +6141,7 @@
         <w:t>(</w:t>
       </w:r>
       <w:proofErr w:type="spellStart"/>
+      <w:proofErr w:type="gramEnd"/>
       <w:r>
         <w:t>idProducto</w:t>
       </w:r>
@@ -6150,12 +6187,17 @@
         </w:numPr>
       </w:pPr>
       <w:proofErr w:type="spellStart"/>
+      <w:proofErr w:type="gramStart"/>
       <w:r>
         <w:t>obtenerTodos</w:t>
       </w:r>
       <w:proofErr w:type="spellEnd"/>
       <w:r>
-        <w:t>()</w:t>
+        <w:t>(</w:t>
+      </w:r>
+      <w:proofErr w:type="gramEnd"/>
+      <w:r>
+        <w:t>)</w:t>
       </w:r>
     </w:p>
     <w:p>
@@ -6201,10 +6243,12 @@
           <w:numId w:val="2"/>
         </w:numPr>
       </w:pPr>
+      <w:proofErr w:type="gramStart"/>
       <w:r>
         <w:t>actualizar(</w:t>
       </w:r>
       <w:proofErr w:type="spellStart"/>
+      <w:proofErr w:type="gramEnd"/>
       <w:r>
         <w:t>idProducto</w:t>
       </w:r>
@@ -6333,13 +6377,18 @@
         </w:numPr>
       </w:pPr>
       <w:r>
-        <w:t>GET /api/clientes/:</w:t>
+        <w:t>GET /api/clientes</w:t>
+      </w:r>
+      <w:proofErr w:type="gramStart"/>
+      <w:r>
+        <w:t>/:</w:t>
       </w:r>
       <w:proofErr w:type="spellStart"/>
       <w:r>
         <w:t>idCliente</w:t>
       </w:r>
       <w:proofErr w:type="spellEnd"/>
+      <w:proofErr w:type="gramEnd"/>
     </w:p>
     <w:p>
       <w:pPr>
@@ -6360,13 +6409,18 @@
         </w:numPr>
       </w:pPr>
       <w:r>
-        <w:t>PUT /api/clientes/:</w:t>
+        <w:t>PUT /api/clientes</w:t>
+      </w:r>
+      <w:proofErr w:type="gramStart"/>
+      <w:r>
+        <w:t>/:</w:t>
       </w:r>
       <w:proofErr w:type="spellStart"/>
       <w:r>
         <w:t>idCliente</w:t>
       </w:r>
       <w:proofErr w:type="spellEnd"/>
+      <w:proofErr w:type="gramEnd"/>
     </w:p>
     <w:p>
       <w:pPr>
@@ -6376,13 +6430,18 @@
         </w:numPr>
       </w:pPr>
       <w:r>
-        <w:t>DELETE /api/clientes/:</w:t>
+        <w:t>DELETE /api/clientes</w:t>
+      </w:r>
+      <w:proofErr w:type="gramStart"/>
+      <w:r>
+        <w:t>/:</w:t>
       </w:r>
       <w:proofErr w:type="spellStart"/>
       <w:r>
         <w:t>idCliente</w:t>
       </w:r>
       <w:proofErr w:type="spellEnd"/>
+      <w:proofErr w:type="gramEnd"/>
     </w:p>
     <w:p>
       <w:r>
@@ -6397,12 +6456,17 @@
         </w:numPr>
       </w:pPr>
       <w:proofErr w:type="spellStart"/>
+      <w:proofErr w:type="gramStart"/>
       <w:r>
         <w:t>obtenerClientes</w:t>
       </w:r>
       <w:proofErr w:type="spellEnd"/>
       <w:r>
-        <w:t>()</w:t>
+        <w:t>(</w:t>
+      </w:r>
+      <w:proofErr w:type="gramEnd"/>
+      <w:r>
+        <w:t>)</w:t>
       </w:r>
     </w:p>
     <w:p>
@@ -6453,6 +6517,7 @@
         </w:numPr>
       </w:pPr>
       <w:proofErr w:type="spellStart"/>
+      <w:proofErr w:type="gramStart"/>
       <w:r>
         <w:t>editarCliente</w:t>
       </w:r>
@@ -6461,6 +6526,7 @@
         <w:t>(</w:t>
       </w:r>
       <w:proofErr w:type="spellStart"/>
+      <w:proofErr w:type="gramEnd"/>
       <w:r>
         <w:t>idCliente</w:t>
       </w:r>
@@ -6506,12 +6572,17 @@
         </w:numPr>
       </w:pPr>
       <w:proofErr w:type="spellStart"/>
+      <w:proofErr w:type="gramStart"/>
       <w:r>
         <w:t>obtenerClientes</w:t>
       </w:r>
       <w:proofErr w:type="spellEnd"/>
       <w:r>
-        <w:t>()</w:t>
+        <w:t>(</w:t>
+      </w:r>
+      <w:proofErr w:type="gramEnd"/>
+      <w:r>
+        <w:t>)</w:t>
       </w:r>
     </w:p>
     <w:p>
@@ -6523,10 +6594,7 @@
       </w:pPr>
       <w:proofErr w:type="spellStart"/>
       <w:r>
-        <w:t>obtenerC</w:t>
-      </w:r>
-      <w:r>
-        <w:t>lientePorId</w:t>
+        <w:t>obtenerClientePorId</w:t>
       </w:r>
       <w:proofErr w:type="spellEnd"/>
       <w:r>
@@ -6565,6 +6633,7 @@
         </w:numPr>
       </w:pPr>
       <w:proofErr w:type="spellStart"/>
+      <w:proofErr w:type="gramStart"/>
       <w:r>
         <w:t>actualizarCliente</w:t>
       </w:r>
@@ -6573,6 +6642,7 @@
         <w:t>(</w:t>
       </w:r>
       <w:proofErr w:type="spellStart"/>
+      <w:proofErr w:type="gramEnd"/>
       <w:r>
         <w:t>idCliente</w:t>
       </w:r>
@@ -6706,13 +6776,18 @@
         </w:numPr>
       </w:pPr>
       <w:r>
-        <w:t>GET /api/proveedores/:</w:t>
+        <w:t>GET /api/proveedores</w:t>
+      </w:r>
+      <w:proofErr w:type="gramStart"/>
+      <w:r>
+        <w:t>/:</w:t>
       </w:r>
       <w:proofErr w:type="spellStart"/>
       <w:r>
         <w:t>idProveedor</w:t>
       </w:r>
       <w:proofErr w:type="spellEnd"/>
+      <w:proofErr w:type="gramEnd"/>
     </w:p>
     <w:p>
       <w:pPr>
@@ -6733,13 +6808,18 @@
         </w:numPr>
       </w:pPr>
       <w:r>
-        <w:t>PUT /api/proveedores/:</w:t>
+        <w:t>PUT /api/proveedores</w:t>
+      </w:r>
+      <w:proofErr w:type="gramStart"/>
+      <w:r>
+        <w:t>/:</w:t>
       </w:r>
       <w:proofErr w:type="spellStart"/>
       <w:r>
         <w:t>idProveedor</w:t>
       </w:r>
       <w:proofErr w:type="spellEnd"/>
+      <w:proofErr w:type="gramEnd"/>
     </w:p>
     <w:p>
       <w:pPr>
@@ -6749,13 +6829,18 @@
         </w:numPr>
       </w:pPr>
       <w:r>
-        <w:t>DELETE /api/proveedores/:</w:t>
+        <w:t>DELETE /api/proveedores</w:t>
+      </w:r>
+      <w:proofErr w:type="gramStart"/>
+      <w:r>
+        <w:t>/:</w:t>
       </w:r>
       <w:proofErr w:type="spellStart"/>
       <w:r>
         <w:t>idProveedor</w:t>
       </w:r>
       <w:proofErr w:type="spellEnd"/>
+      <w:proofErr w:type="gramEnd"/>
     </w:p>
     <w:p>
       <w:r>
@@ -6770,13 +6855,18 @@
         </w:numPr>
       </w:pPr>
       <w:proofErr w:type="spellStart"/>
+      <w:proofErr w:type="gramStart"/>
       <w:r>
         <w:lastRenderedPageBreak/>
         <w:t>obtenerProveedores</w:t>
       </w:r>
       <w:proofErr w:type="spellEnd"/>
       <w:r>
-        <w:t>()</w:t>
+        <w:t>(</w:t>
+      </w:r>
+      <w:proofErr w:type="gramEnd"/>
+      <w:r>
+        <w:t>)</w:t>
       </w:r>
     </w:p>
     <w:p>
@@ -6827,6 +6917,7 @@
         </w:numPr>
       </w:pPr>
       <w:proofErr w:type="spellStart"/>
+      <w:proofErr w:type="gramStart"/>
       <w:r>
         <w:t>editarProveedor</w:t>
       </w:r>
@@ -6835,6 +6926,7 @@
         <w:t>(</w:t>
       </w:r>
       <w:proofErr w:type="spellStart"/>
+      <w:proofErr w:type="gramEnd"/>
       <w:r>
         <w:t>idProveedor</w:t>
       </w:r>
@@ -6880,12 +6972,17 @@
         </w:numPr>
       </w:pPr>
       <w:proofErr w:type="spellStart"/>
+      <w:proofErr w:type="gramStart"/>
       <w:r>
         <w:t>obtenerProveedores</w:t>
       </w:r>
       <w:proofErr w:type="spellEnd"/>
       <w:r>
-        <w:t>()</w:t>
+        <w:t>(</w:t>
+      </w:r>
+      <w:proofErr w:type="gramEnd"/>
+      <w:r>
+        <w:t>)</w:t>
       </w:r>
     </w:p>
     <w:p>
@@ -6936,6 +7033,7 @@
         </w:numPr>
       </w:pPr>
       <w:proofErr w:type="spellStart"/>
+      <w:proofErr w:type="gramStart"/>
       <w:r>
         <w:t>actualizarProveedor</w:t>
       </w:r>
@@ -6944,6 +7042,7 @@
         <w:t>(</w:t>
       </w:r>
       <w:proofErr w:type="spellStart"/>
+      <w:proofErr w:type="gramEnd"/>
       <w:r>
         <w:t>idProveedor</w:t>
       </w:r>
@@ -7066,13 +7165,18 @@
         </w:numPr>
       </w:pPr>
       <w:r>
-        <w:t>GET /api/compras/:</w:t>
+        <w:t>GET /api/compras</w:t>
+      </w:r>
+      <w:proofErr w:type="gramStart"/>
+      <w:r>
+        <w:t>/:</w:t>
       </w:r>
       <w:proofErr w:type="spellStart"/>
       <w:r>
         <w:t>idCompra</w:t>
       </w:r>
       <w:proofErr w:type="spellEnd"/>
+      <w:proofErr w:type="gramEnd"/>
     </w:p>
     <w:p>
       <w:pPr>
@@ -7098,12 +7202,17 @@
         </w:numPr>
       </w:pPr>
       <w:proofErr w:type="spellStart"/>
+      <w:proofErr w:type="gramStart"/>
       <w:r>
         <w:t>obtenerCompras</w:t>
       </w:r>
       <w:proofErr w:type="spellEnd"/>
       <w:r>
-        <w:t>()</w:t>
+        <w:t>(</w:t>
+      </w:r>
+      <w:proofErr w:type="gramEnd"/>
+      <w:r>
+        <w:t>)</w:t>
       </w:r>
     </w:p>
     <w:p>
@@ -7167,12 +7276,17 @@
         </w:numPr>
       </w:pPr>
       <w:proofErr w:type="spellStart"/>
+      <w:proofErr w:type="gramStart"/>
       <w:r>
         <w:t>obtenerCompras</w:t>
       </w:r>
       <w:proofErr w:type="spellEnd"/>
       <w:r>
-        <w:t>()</w:t>
+        <w:t>(</w:t>
+      </w:r>
+      <w:proofErr w:type="gramEnd"/>
+      <w:r>
+        <w:t>)</w:t>
       </w:r>
     </w:p>
     <w:p>
@@ -7321,16 +7435,18 @@
         </w:numPr>
       </w:pPr>
       <w:r>
-        <w:t>GET /api</w:t>
-      </w:r>
-      <w:r>
-        <w:t>/ventas/:</w:t>
+        <w:t>GET /api/ventas</w:t>
+      </w:r>
+      <w:proofErr w:type="gramStart"/>
+      <w:r>
+        <w:t>/:</w:t>
       </w:r>
       <w:proofErr w:type="spellStart"/>
       <w:r>
         <w:t>idVenta</w:t>
       </w:r>
       <w:proofErr w:type="spellEnd"/>
+      <w:proofErr w:type="gramEnd"/>
     </w:p>
     <w:p>
       <w:pPr>
@@ -7356,12 +7472,17 @@
         </w:numPr>
       </w:pPr>
       <w:proofErr w:type="spellStart"/>
+      <w:proofErr w:type="gramStart"/>
       <w:r>
         <w:t>obtenerVentas</w:t>
       </w:r>
       <w:proofErr w:type="spellEnd"/>
       <w:r>
-        <w:t>()</w:t>
+        <w:t>(</w:t>
+      </w:r>
+      <w:proofErr w:type="gramEnd"/>
+      <w:r>
+        <w:t>)</w:t>
       </w:r>
     </w:p>
     <w:p>
@@ -7426,12 +7547,17 @@
         </w:numPr>
       </w:pPr>
       <w:proofErr w:type="spellStart"/>
+      <w:proofErr w:type="gramStart"/>
       <w:r>
         <w:t>obtenerVentas</w:t>
       </w:r>
       <w:proofErr w:type="spellEnd"/>
       <w:r>
-        <w:t>()</w:t>
+        <w:t>(</w:t>
+      </w:r>
+      <w:proofErr w:type="gramEnd"/>
+      <w:r>
+        <w:t>)</w:t>
       </w:r>
     </w:p>
     <w:p>
@@ -7580,13 +7706,18 @@
         </w:numPr>
       </w:pPr>
       <w:r>
-        <w:t>GET /api/recibos/:</w:t>
+        <w:t>GET /api/recibos</w:t>
+      </w:r>
+      <w:proofErr w:type="gramStart"/>
+      <w:r>
+        <w:t>/:</w:t>
       </w:r>
       <w:proofErr w:type="spellStart"/>
       <w:r>
         <w:t>idRecibo</w:t>
       </w:r>
       <w:proofErr w:type="spellEnd"/>
+      <w:proofErr w:type="gramEnd"/>
     </w:p>
     <w:p>
       <w:pPr>
@@ -7612,12 +7743,17 @@
         </w:numPr>
       </w:pPr>
       <w:proofErr w:type="spellStart"/>
+      <w:proofErr w:type="gramStart"/>
       <w:r>
         <w:t>obtenerRecibos</w:t>
       </w:r>
       <w:proofErr w:type="spellEnd"/>
       <w:r>
-        <w:t>()</w:t>
+        <w:t>(</w:t>
+      </w:r>
+      <w:proofErr w:type="gramEnd"/>
+      <w:r>
+        <w:t>)</w:t>
       </w:r>
     </w:p>
     <w:p>
@@ -7673,12 +7809,17 @@
         </w:numPr>
       </w:pPr>
       <w:proofErr w:type="spellStart"/>
+      <w:proofErr w:type="gramStart"/>
       <w:r>
         <w:t>obtenerRecibos</w:t>
       </w:r>
       <w:proofErr w:type="spellEnd"/>
       <w:r>
-        <w:t>()</w:t>
+        <w:t>(</w:t>
+      </w:r>
+      <w:proofErr w:type="gramEnd"/>
+      <w:r>
+        <w:t>)</w:t>
       </w:r>
     </w:p>
     <w:p>
@@ -7690,10 +7831,7 @@
       </w:pPr>
       <w:proofErr w:type="spellStart"/>
       <w:r>
-        <w:t>obtenerReci</w:t>
-      </w:r>
-      <w:r>
-        <w:t>boPorId</w:t>
+        <w:t>obtenerReciboPorId</w:t>
       </w:r>
       <w:proofErr w:type="spellEnd"/>
       <w:r>
@@ -7837,6 +7975,7 @@
         </w:numPr>
       </w:pPr>
       <w:proofErr w:type="spellStart"/>
+      <w:proofErr w:type="gramStart"/>
       <w:r>
         <w:t>validarStockDisponible</w:t>
       </w:r>
@@ -7845,6 +7984,7 @@
         <w:t>(</w:t>
       </w:r>
       <w:proofErr w:type="spellStart"/>
+      <w:proofErr w:type="gramEnd"/>
       <w:r>
         <w:t>idProducto</w:t>
       </w:r>
@@ -7866,6 +8006,7 @@
         </w:numPr>
       </w:pPr>
       <w:proofErr w:type="spellStart"/>
+      <w:proofErr w:type="gramStart"/>
       <w:r>
         <w:t>actualizarStock</w:t>
       </w:r>
@@ -7874,6 +8015,7 @@
         <w:t>(</w:t>
       </w:r>
       <w:proofErr w:type="spellStart"/>
+      <w:proofErr w:type="gramEnd"/>
       <w:r>
         <w:t>idProducto</w:t>
       </w:r>
@@ -8234,10 +8376,7 @@
         </w:rPr>
       </w:pPr>
       <w:r>
-        <w:t>En el área de entrega del TP, cada integrante debe colocar úni</w:t>
-      </w:r>
-      <w:r>
-        <w:t>camente el link del Drive del grupo</w:t>
+        <w:t>En el área de entrega del TP, cada integrante debe colocar únicamente el link del Drive del grupo</w:t>
       </w:r>
       <w:r>
         <w:rPr>
@@ -8279,10 +8418,7 @@
     </w:p>
     <w:p>
       <w:r>
-        <w:t>Desarrollar una aplicación web ut</w:t>
-      </w:r>
-      <w:r>
-        <w:t>ilizando Node.js y Express.</w:t>
+        <w:t>Desarrollar una aplicación web utilizando Node.js y Express.</w:t>
       </w:r>
     </w:p>
     <w:p>

</xml_diff>